<commit_message>
se agrego la Documentacion para el sprint 3
</commit_message>
<xml_diff>
--- a/Documentacion/Proyecto Integrador TeraStore.docx
+++ b/Documentacion/Proyecto Integrador TeraStore.docx
@@ -79,16 +79,8 @@
         <w:rPr>
           <w:lang w:val="es-ES"/>
         </w:rPr>
-        <w:t xml:space="preserve">Ing. Pablo </w:t>
-      </w:r>
-      <w:proofErr w:type="spellStart"/>
-      <w:r>
-        <w:rPr>
-          <w:lang w:val="es-ES"/>
-        </w:rPr>
-        <w:t>Slame</w:t>
-      </w:r>
-      <w:proofErr w:type="spellEnd"/>
+        <w:t>Ing. Pablo Slame</w:t>
+      </w:r>
     </w:p>
     <w:p>
       <w:pPr>
@@ -131,21 +123,7 @@
         <w:rPr>
           <w:lang w:val="es-ES"/>
         </w:rPr>
-        <w:t xml:space="preserve">– Lic. </w:t>
-      </w:r>
-      <w:proofErr w:type="spellStart"/>
-      <w:r>
-        <w:rPr>
-          <w:lang w:val="es-ES"/>
-        </w:rPr>
-        <w:t>Caceres</w:t>
-      </w:r>
-      <w:proofErr w:type="spellEnd"/>
-      <w:r>
-        <w:rPr>
-          <w:lang w:val="es-ES"/>
-        </w:rPr>
-        <w:t xml:space="preserve"> Gastón</w:t>
+        <w:t>– Lic. Caceres Gastón</w:t>
       </w:r>
     </w:p>
     <w:p>
@@ -229,14 +207,12 @@
         </w:rPr>
         <w:t xml:space="preserve">NOMBRE DEL EQUIPO: </w:t>
       </w:r>
-      <w:proofErr w:type="spellStart"/>
       <w:r>
         <w:rPr>
           <w:lang w:val="es-ES"/>
         </w:rPr>
         <w:t>DataMinds</w:t>
       </w:r>
-      <w:proofErr w:type="spellEnd"/>
     </w:p>
     <w:p>
       <w:pPr>
@@ -260,14 +236,12 @@
         </w:rPr>
         <w:t xml:space="preserve"> </w:t>
       </w:r>
-      <w:proofErr w:type="spellStart"/>
       <w:r>
         <w:rPr>
           <w:lang w:val="es-ES"/>
         </w:rPr>
         <w:t>TeraStore</w:t>
       </w:r>
-      <w:proofErr w:type="spellEnd"/>
     </w:p>
     <w:p>
       <w:pPr>
@@ -2247,21 +2221,7 @@
         <w:rPr>
           <w:lang w:val="es-ES"/>
         </w:rPr>
-        <w:t xml:space="preserve">: </w:t>
-      </w:r>
-      <w:proofErr w:type="spellStart"/>
-      <w:r>
-        <w:rPr>
-          <w:lang w:val="es-ES"/>
-        </w:rPr>
-        <w:t>DallAgnese</w:t>
-      </w:r>
-      <w:proofErr w:type="spellEnd"/>
-      <w:r>
-        <w:rPr>
-          <w:lang w:val="es-ES"/>
-        </w:rPr>
-        <w:t xml:space="preserve"> Lucas – Malaquias Daniel</w:t>
+        <w:t>: DallAgnese Lucas – Malaquias Daniel</w:t>
       </w:r>
     </w:p>
     <w:p>
@@ -2344,21 +2304,7 @@
         <w:rPr>
           <w:lang w:val="es-ES"/>
         </w:rPr>
-        <w:t xml:space="preserve">: Sirve como practica y aplicar los conocimientos dados en clase como aprender a utilizar </w:t>
-      </w:r>
-      <w:proofErr w:type="spellStart"/>
-      <w:r>
-        <w:rPr>
-          <w:lang w:val="es-ES"/>
-        </w:rPr>
-        <w:t>laravel</w:t>
-      </w:r>
-      <w:proofErr w:type="spellEnd"/>
-      <w:r>
-        <w:rPr>
-          <w:lang w:val="es-ES"/>
-        </w:rPr>
-        <w:t>, practicar con código como POO, aprender a desplegar aplicaciones y adquirir conocimientos necesarios para el mundo laboral.</w:t>
+        <w:t>: Sirve como practica y aplicar los conocimientos dados en clase como aprender a utilizar laravel, practicar con código como POO, aprender a desplegar aplicaciones y adquirir conocimientos necesarios para el mundo laboral.</w:t>
       </w:r>
     </w:p>
     <w:p>
@@ -2416,21 +2362,7 @@
         <w:rPr>
           <w:lang w:val="es-ES"/>
         </w:rPr>
-        <w:t xml:space="preserve">Estaría beneficiando tanto a entusiastas de PC </w:t>
-      </w:r>
-      <w:proofErr w:type="spellStart"/>
-      <w:r>
-        <w:rPr>
-          <w:lang w:val="es-ES"/>
-        </w:rPr>
-        <w:t>gamers</w:t>
-      </w:r>
-      <w:proofErr w:type="spellEnd"/>
-      <w:r>
-        <w:rPr>
-          <w:lang w:val="es-ES"/>
-        </w:rPr>
-        <w:t xml:space="preserve"> y vendedores de componentes como a nosotros los desarrolladores a la hora de implementar los conocimientos adquiridos en clase.</w:t>
+        <w:t>Estaría beneficiando tanto a entusiastas de PC gamers y vendedores de componentes como a nosotros los desarrolladores a la hora de implementar los conocimientos adquiridos en clase.</w:t>
       </w:r>
     </w:p>
     <w:p>
@@ -3081,6 +3013,7 @@
       </w:pPr>
       <w:r>
         <w:rPr>
+          <w:noProof/>
           <w:lang w:val="es-ES"/>
         </w:rPr>
         <w:drawing>
@@ -3164,6 +3097,7 @@
       </w:pPr>
       <w:r>
         <w:rPr>
+          <w:noProof/>
           <w:lang w:val="es-ES"/>
         </w:rPr>
         <w:drawing>
@@ -3270,6 +3204,7 @@
       <w:bookmarkStart w:id="19" w:name="_Toc209728224"/>
       <w:r>
         <w:rPr>
+          <w:noProof/>
           <w:lang w:val="es-ES"/>
         </w:rPr>
         <w:drawing>
@@ -3338,6 +3273,7 @@
       </w:pPr>
       <w:r>
         <w:rPr>
+          <w:noProof/>
           <w:lang w:val="es-ES"/>
         </w:rPr>
         <w:drawing>
@@ -3426,10 +3362,11 @@
       </w:pPr>
       <w:r>
         <w:rPr>
+          <w:noProof/>
           <w:lang w:val="es-ES"/>
         </w:rPr>
         <w:drawing>
-          <wp:anchor distT="0" distB="0" distL="114300" distR="114300" simplePos="0" relativeHeight="251668480" behindDoc="0" locked="0" layoutInCell="1" allowOverlap="1" wp14:anchorId="6923E984" wp14:editId="68356CEF">
+          <wp:anchor distT="0" distB="0" distL="114300" distR="114300" simplePos="0" relativeHeight="251668480" behindDoc="0" locked="0" layoutInCell="1" allowOverlap="1" wp14:anchorId="6923E984" wp14:editId="2EC322E7">
             <wp:simplePos x="0" y="0"/>
             <wp:positionH relativeFrom="margin">
               <wp:align>right</wp:align>
@@ -3509,10 +3446,11 @@
       </w:pPr>
       <w:r>
         <w:rPr>
+          <w:noProof/>
           <w:lang w:val="es-ES"/>
         </w:rPr>
         <w:drawing>
-          <wp:anchor distT="0" distB="0" distL="114300" distR="114300" simplePos="0" relativeHeight="251669504" behindDoc="0" locked="0" layoutInCell="1" allowOverlap="1" wp14:anchorId="3425AD68" wp14:editId="17366B3F">
+          <wp:anchor distT="0" distB="0" distL="114300" distR="114300" simplePos="0" relativeHeight="251669504" behindDoc="0" locked="0" layoutInCell="1" allowOverlap="1" wp14:anchorId="3425AD68" wp14:editId="72E797C8">
             <wp:simplePos x="0" y="0"/>
             <wp:positionH relativeFrom="margin">
               <wp:align>right</wp:align>
@@ -3565,479 +3503,27 @@
         <w:rPr>
           <w:lang w:val="es-ES"/>
         </w:rPr>
-        <w:t xml:space="preserve">Aquí el usuario que ya tiene una cuenta se podrá </w:t>
-      </w:r>
-      <w:proofErr w:type="spellStart"/>
-      <w:r>
-        <w:rPr>
-          <w:lang w:val="es-ES"/>
-        </w:rPr>
-        <w:t>loguear</w:t>
-      </w:r>
-      <w:proofErr w:type="spellEnd"/>
-      <w:r>
-        <w:rPr>
-          <w:lang w:val="es-ES"/>
-        </w:rPr>
-        <w:t xml:space="preserve"> nuevamente.</w:t>
-      </w:r>
-    </w:p>
-    <w:tbl>
-      <w:tblPr>
-        <w:tblStyle w:val="Tablaconcuadrcula"/>
-        <w:tblpPr w:leftFromText="141" w:rightFromText="141" w:vertAnchor="text" w:horzAnchor="margin" w:tblpY="11016"/>
-        <w:tblW w:w="8636" w:type="dxa"/>
-        <w:tblLayout w:type="fixed"/>
-        <w:tblLook w:val="04A0" w:firstRow="1" w:lastRow="0" w:firstColumn="1" w:lastColumn="0" w:noHBand="0" w:noVBand="1"/>
-      </w:tblPr>
-      <w:tblGrid>
-        <w:gridCol w:w="969"/>
-        <w:gridCol w:w="869"/>
-        <w:gridCol w:w="6798"/>
-      </w:tblGrid>
-      <w:tr>
-        <w:tc>
-          <w:tcPr>
-            <w:tcW w:w="969" w:type="dxa"/>
-            <w:shd w:val="clear" w:color="auto" w:fill="45B0E1" w:themeFill="accent1" w:themeFillTint="99"/>
-          </w:tcPr>
-          <w:p>
-            <w:pPr>
-              <w:jc w:val="center"/>
-              <w:rPr>
-                <w:lang w:val="es-ES"/>
-              </w:rPr>
-            </w:pPr>
-            <w:r>
-              <w:rPr>
-                <w:lang w:val="es-ES"/>
-              </w:rPr>
-              <w:lastRenderedPageBreak/>
-              <w:t>Herramienta</w:t>
-            </w:r>
-          </w:p>
-        </w:tc>
-        <w:tc>
-          <w:tcPr>
-            <w:tcW w:w="869" w:type="dxa"/>
-            <w:shd w:val="clear" w:color="auto" w:fill="45B0E1" w:themeFill="accent1" w:themeFillTint="99"/>
-          </w:tcPr>
-          <w:p>
-            <w:pPr>
-              <w:jc w:val="center"/>
-              <w:rPr>
-                <w:lang w:val="es-ES"/>
-              </w:rPr>
-            </w:pPr>
-            <w:r>
-              <w:rPr>
-                <w:lang w:val="es-ES"/>
-              </w:rPr>
-              <w:t>Versión</w:t>
-            </w:r>
-          </w:p>
-        </w:tc>
-        <w:tc>
-          <w:tcPr>
-            <w:tcW w:w="6798" w:type="dxa"/>
-            <w:shd w:val="clear" w:color="auto" w:fill="45B0E1" w:themeFill="accent1" w:themeFillTint="99"/>
-          </w:tcPr>
-          <w:p>
-            <w:pPr>
-              <w:jc w:val="center"/>
-              <w:rPr>
-                <w:lang w:val="es-ES"/>
-              </w:rPr>
-            </w:pPr>
-            <w:r>
-              <w:rPr>
-                <w:lang w:val="es-ES"/>
-              </w:rPr>
-              <w:t>Enlace</w:t>
-            </w:r>
-          </w:p>
-        </w:tc>
-      </w:tr>
-      <w:tr>
-        <w:trPr>
-          <w:trHeight w:val="673"/>
-        </w:trPr>
-        <w:tc>
-          <w:tcPr>
-            <w:tcW w:w="969" w:type="dxa"/>
-            <w:shd w:val="clear" w:color="auto" w:fill="FFFFFF" w:themeFill="background1"/>
-          </w:tcPr>
-          <w:p>
-            <w:pPr>
-              <w:jc w:val="center"/>
-              <w:rPr>
-                <w:lang w:val="es-ES"/>
-              </w:rPr>
-            </w:pPr>
-            <w:r>
-              <w:rPr>
-                <w:lang w:val="es-ES"/>
-              </w:rPr>
-              <w:t>Trello</w:t>
-            </w:r>
-          </w:p>
-        </w:tc>
-        <w:tc>
-          <w:tcPr>
-            <w:tcW w:w="869" w:type="dxa"/>
-            <w:shd w:val="clear" w:color="auto" w:fill="FFFFFF" w:themeFill="background1"/>
-          </w:tcPr>
-          <w:p>
-            <w:pPr>
-              <w:jc w:val="center"/>
-              <w:rPr>
-                <w:lang w:val="es-ES"/>
-              </w:rPr>
-            </w:pPr>
-            <w:r>
-              <w:rPr>
-                <w:lang w:val="es-ES"/>
-              </w:rPr>
-              <w:t>Web</w:t>
-            </w:r>
-          </w:p>
-        </w:tc>
-        <w:tc>
-          <w:tcPr>
-            <w:tcW w:w="6798" w:type="dxa"/>
-            <w:shd w:val="clear" w:color="auto" w:fill="FFFFFF" w:themeFill="background1"/>
-          </w:tcPr>
-          <w:p>
-            <w:pPr>
-              <w:jc w:val="center"/>
-              <w:rPr>
-                <w:lang w:val="es-ES"/>
-              </w:rPr>
-            </w:pPr>
-            <w:hyperlink r:id="rId24" w:history="1">
-              <w:r>
-                <w:rPr>
-                  <w:rStyle w:val="Hipervnculo"/>
-                  <w:lang w:val="es-ES"/>
-                </w:rPr>
-                <w:t>https://trello.com/invite/b/6824f1244c774299daa63e05/ATTI4f4ba18515ee1e78a96ca10fd415c25027583D96/tpi-datamids</w:t>
-              </w:r>
-            </w:hyperlink>
-          </w:p>
-        </w:tc>
-      </w:tr>
-      <w:tr>
-        <w:trPr>
-          <w:trHeight w:val="203"/>
-        </w:trPr>
-        <w:tc>
-          <w:tcPr>
-            <w:tcW w:w="969" w:type="dxa"/>
-            <w:shd w:val="clear" w:color="auto" w:fill="C1E4F5" w:themeFill="accent1" w:themeFillTint="33"/>
-          </w:tcPr>
-          <w:p>
-            <w:pPr>
-              <w:jc w:val="center"/>
-              <w:rPr>
-                <w:lang w:val="es-ES"/>
-              </w:rPr>
-            </w:pPr>
-            <w:r>
-              <w:rPr>
-                <w:lang w:val="es-ES"/>
-              </w:rPr>
-              <w:t>GitHub</w:t>
-            </w:r>
-          </w:p>
-        </w:tc>
-        <w:tc>
-          <w:tcPr>
-            <w:tcW w:w="869" w:type="dxa"/>
-            <w:shd w:val="clear" w:color="auto" w:fill="C1E4F5" w:themeFill="accent1" w:themeFillTint="33"/>
-          </w:tcPr>
-          <w:p>
-            <w:pPr>
-              <w:jc w:val="center"/>
-              <w:rPr>
-                <w:lang w:val="es-ES"/>
-              </w:rPr>
-            </w:pPr>
-            <w:r>
-              <w:rPr>
-                <w:lang w:val="es-ES"/>
-              </w:rPr>
-              <w:t>Web</w:t>
-            </w:r>
-          </w:p>
-        </w:tc>
-        <w:tc>
-          <w:tcPr>
-            <w:tcW w:w="6798" w:type="dxa"/>
-            <w:shd w:val="clear" w:color="auto" w:fill="C1E4F5" w:themeFill="accent1" w:themeFillTint="33"/>
-          </w:tcPr>
-          <w:p>
-            <w:pPr>
-              <w:jc w:val="center"/>
-              <w:rPr>
-                <w:lang w:val="es-ES"/>
-              </w:rPr>
-            </w:pPr>
-            <w:hyperlink r:id="rId25" w:history="1">
-              <w:r>
-                <w:rPr>
-                  <w:rStyle w:val="Hipervnculo"/>
-                  <w:lang w:val="es-ES"/>
-                </w:rPr>
-                <w:t>https://github.com/LucaseDallAgnese/Proyecto_Integrador.git</w:t>
-              </w:r>
-            </w:hyperlink>
-          </w:p>
-        </w:tc>
-      </w:tr>
-      <w:tr>
-        <w:trPr>
-          <w:trHeight w:val="203"/>
-        </w:trPr>
-        <w:tc>
-          <w:tcPr>
-            <w:tcW w:w="969" w:type="dxa"/>
-            <w:shd w:val="clear" w:color="auto" w:fill="FFFFFF" w:themeFill="background1"/>
-          </w:tcPr>
-          <w:p>
-            <w:pPr>
-              <w:jc w:val="center"/>
-              <w:rPr>
-                <w:lang w:val="es-ES"/>
-              </w:rPr>
-            </w:pPr>
-            <w:r>
-              <w:rPr>
-                <w:lang w:val="es-ES"/>
-              </w:rPr>
-              <w:t>Git</w:t>
-            </w:r>
-          </w:p>
-        </w:tc>
-        <w:tc>
-          <w:tcPr>
-            <w:tcW w:w="869" w:type="dxa"/>
-            <w:shd w:val="clear" w:color="auto" w:fill="FFFFFF" w:themeFill="background1"/>
-          </w:tcPr>
-          <w:p>
-            <w:pPr>
-              <w:jc w:val="center"/>
-              <w:rPr>
-                <w:b/>
-                <w:bCs/>
-                <w:lang w:val="es-ES"/>
-              </w:rPr>
-            </w:pPr>
-            <w:r>
-              <w:rPr>
-                <w:b/>
-                <w:bCs/>
-                <w:lang w:val="es-ES"/>
-              </w:rPr>
-              <w:t>5.6.2</w:t>
-            </w:r>
-          </w:p>
-        </w:tc>
-        <w:tc>
-          <w:tcPr>
-            <w:tcW w:w="6798" w:type="dxa"/>
-            <w:shd w:val="clear" w:color="auto" w:fill="FFFFFF" w:themeFill="background1"/>
-          </w:tcPr>
-          <w:p>
-            <w:pPr>
-              <w:jc w:val="center"/>
-              <w:rPr>
-                <w:lang w:val="es-ES"/>
-              </w:rPr>
-            </w:pPr>
-            <w:hyperlink r:id="rId26" w:history="1">
-              <w:r>
-                <w:rPr>
-                  <w:rStyle w:val="Hipervnculo"/>
-                  <w:lang w:val="es-ES"/>
-                </w:rPr>
-                <w:t>https://git-scm.com/</w:t>
-              </w:r>
-            </w:hyperlink>
-          </w:p>
-        </w:tc>
-      </w:tr>
-      <w:tr>
-        <w:trPr>
-          <w:trHeight w:val="203"/>
-        </w:trPr>
-        <w:tc>
-          <w:tcPr>
-            <w:tcW w:w="969" w:type="dxa"/>
-            <w:shd w:val="clear" w:color="auto" w:fill="C1E4F5" w:themeFill="accent1" w:themeFillTint="33"/>
-          </w:tcPr>
-          <w:p>
-            <w:pPr>
-              <w:jc w:val="center"/>
-              <w:rPr>
-                <w:lang w:val="es-ES"/>
-              </w:rPr>
-            </w:pPr>
-            <w:r>
-              <w:rPr>
-                <w:lang w:val="es-ES"/>
-              </w:rPr>
-              <w:t>Visual</w:t>
-            </w:r>
-          </w:p>
-          <w:p>
-            <w:pPr>
-              <w:jc w:val="center"/>
-              <w:rPr>
-                <w:lang w:val="es-ES"/>
-              </w:rPr>
-            </w:pPr>
-            <w:r>
-              <w:rPr>
-                <w:lang w:val="es-ES"/>
-              </w:rPr>
-              <w:t>Studio</w:t>
-            </w:r>
-          </w:p>
-          <w:p>
-            <w:pPr>
-              <w:jc w:val="center"/>
-              <w:rPr>
-                <w:lang w:val="es-ES"/>
-              </w:rPr>
-            </w:pPr>
-            <w:r>
-              <w:rPr>
-                <w:lang w:val="es-ES"/>
-              </w:rPr>
-              <w:t>Code</w:t>
-            </w:r>
-          </w:p>
-        </w:tc>
-        <w:tc>
-          <w:tcPr>
-            <w:tcW w:w="869" w:type="dxa"/>
-            <w:shd w:val="clear" w:color="auto" w:fill="C1E4F5" w:themeFill="accent1" w:themeFillTint="33"/>
-          </w:tcPr>
-          <w:p>
-            <w:pPr>
-              <w:jc w:val="center"/>
-              <w:rPr>
-                <w:b/>
-                <w:bCs/>
-              </w:rPr>
-            </w:pPr>
-          </w:p>
-          <w:p>
-            <w:pPr>
-              <w:jc w:val="center"/>
-              <w:rPr>
-                <w:lang w:val="es-ES"/>
-              </w:rPr>
-            </w:pPr>
-            <w:r>
-              <w:rPr>
-                <w:b/>
-                <w:bCs/>
-              </w:rPr>
-              <w:t xml:space="preserve"> 1</w:t>
-            </w:r>
-            <w:r>
-              <w:rPr>
-                <w:b/>
-                <w:bCs/>
-                <w:shd w:val="clear" w:color="auto" w:fill="C1E4F5" w:themeFill="accent1" w:themeFillTint="33"/>
-              </w:rPr>
-              <w:t>.</w:t>
-            </w:r>
-            <w:r>
-              <w:rPr>
-                <w:b/>
-                <w:bCs/>
-              </w:rPr>
-              <w:t>103</w:t>
-            </w:r>
-          </w:p>
-        </w:tc>
-        <w:tc>
-          <w:tcPr>
-            <w:tcW w:w="6798" w:type="dxa"/>
-            <w:shd w:val="clear" w:color="auto" w:fill="C1E4F5" w:themeFill="accent1" w:themeFillTint="33"/>
-          </w:tcPr>
-          <w:p>
-            <w:pPr>
-              <w:spacing w:before="240"/>
-              <w:jc w:val="center"/>
-              <w:rPr>
-                <w:lang w:val="es-ES"/>
-              </w:rPr>
-            </w:pPr>
-            <w:hyperlink r:id="rId27" w:history="1">
-              <w:r>
-                <w:rPr>
-                  <w:rStyle w:val="Hipervnculo"/>
-                </w:rPr>
-                <w:t xml:space="preserve">Visual Studio </w:t>
-              </w:r>
-              <w:proofErr w:type="spellStart"/>
-              <w:r>
-                <w:rPr>
-                  <w:rStyle w:val="Hipervnculo"/>
-                </w:rPr>
-                <w:t>Code</w:t>
-              </w:r>
-              <w:proofErr w:type="spellEnd"/>
-              <w:r>
-                <w:rPr>
-                  <w:rStyle w:val="Hipervnculo"/>
-                </w:rPr>
-                <w:t xml:space="preserve"> - </w:t>
-              </w:r>
-              <w:proofErr w:type="spellStart"/>
-              <w:r>
-                <w:rPr>
-                  <w:rStyle w:val="Hipervnculo"/>
-                </w:rPr>
-                <w:t>Code</w:t>
-              </w:r>
-              <w:proofErr w:type="spellEnd"/>
-              <w:r>
-                <w:rPr>
-                  <w:rStyle w:val="Hipervnculo"/>
-                </w:rPr>
-                <w:t xml:space="preserve"> </w:t>
-              </w:r>
-              <w:proofErr w:type="spellStart"/>
-              <w:r>
-                <w:rPr>
-                  <w:rStyle w:val="Hipervnculo"/>
-                </w:rPr>
-                <w:t>Editing</w:t>
-              </w:r>
-              <w:proofErr w:type="spellEnd"/>
-              <w:r>
-                <w:rPr>
-                  <w:rStyle w:val="Hipervnculo"/>
-                </w:rPr>
-                <w:t xml:space="preserve">. </w:t>
-              </w:r>
-              <w:proofErr w:type="spellStart"/>
-              <w:r>
-                <w:rPr>
-                  <w:rStyle w:val="Hipervnculo"/>
-                </w:rPr>
-                <w:t>Redefined</w:t>
-              </w:r>
-              <w:proofErr w:type="spellEnd"/>
-            </w:hyperlink>
-          </w:p>
-        </w:tc>
-      </w:tr>
-    </w:tbl>
+        <w:t>Aquí el usuario que ya tiene una cuenta se podrá loguear nuevamente.</w:t>
+      </w:r>
+    </w:p>
+    <w:p>
+      <w:pPr>
+        <w:rPr>
+          <w:rFonts w:eastAsiaTheme="majorEastAsia" w:cstheme="majorBidi"/>
+          <w:color w:val="0F4761" w:themeColor="accent1" w:themeShade="BF"/>
+          <w:sz w:val="28"/>
+          <w:szCs w:val="28"/>
+          <w:lang w:val="es-ES"/>
+        </w:rPr>
+      </w:pPr>
+      <w:bookmarkStart w:id="21" w:name="_Toc209728226"/>
+      <w:r>
+        <w:rPr>
+          <w:lang w:val="es-ES"/>
+        </w:rPr>
+        <w:br w:type="page"/>
+      </w:r>
+    </w:p>
     <w:p>
       <w:pPr>
         <w:pStyle w:val="Ttulo3"/>
@@ -4046,11 +3532,11 @@
           <w:lang w:val="es-ES"/>
         </w:rPr>
       </w:pPr>
-      <w:bookmarkStart w:id="21" w:name="_Toc209728226"/>
-      <w:r>
-        <w:rPr>
-          <w:lang w:val="es-ES"/>
-        </w:rPr>
+      <w:r>
+        <w:rPr>
+          <w:lang w:val="es-ES"/>
+        </w:rPr>
+        <w:lastRenderedPageBreak/>
         <w:t>Registro</w:t>
       </w:r>
       <w:bookmarkEnd w:id="21"/>
@@ -4063,29 +3549,17 @@
       </w:pPr>
       <w:r>
         <w:rPr>
-          <w:lang w:val="es-ES"/>
-        </w:rPr>
-        <w:t>Aquí el usuario se podrá registrar por primera vez.</w:t>
-      </w:r>
-    </w:p>
-    <w:p>
-      <w:pPr>
-        <w:rPr>
-          <w:lang w:val="es-ES"/>
-        </w:rPr>
-      </w:pPr>
-      <w:r>
-        <w:rPr>
+          <w:noProof/>
           <w:lang w:val="es-ES"/>
         </w:rPr>
         <w:drawing>
-          <wp:anchor distT="0" distB="0" distL="114300" distR="114300" simplePos="0" relativeHeight="251670528" behindDoc="0" locked="0" layoutInCell="1" allowOverlap="1" wp14:anchorId="01018789" wp14:editId="299B4890">
+          <wp:anchor distT="0" distB="0" distL="114300" distR="114300" simplePos="0" relativeHeight="251670528" behindDoc="0" locked="0" layoutInCell="1" allowOverlap="1" wp14:anchorId="01018789" wp14:editId="2EACDA28">
             <wp:simplePos x="0" y="0"/>
-            <wp:positionH relativeFrom="column">
-              <wp:posOffset>1905</wp:posOffset>
+            <wp:positionH relativeFrom="margin">
+              <wp:align>left</wp:align>
             </wp:positionH>
             <wp:positionV relativeFrom="page">
-              <wp:posOffset>1516380</wp:posOffset>
+              <wp:posOffset>1501140</wp:posOffset>
             </wp:positionV>
             <wp:extent cx="5400040" cy="3091815"/>
             <wp:effectExtent l="0" t="0" r="0" b="0"/>
@@ -4102,7 +3576,7 @@
                     <pic:cNvPicPr/>
                   </pic:nvPicPr>
                   <pic:blipFill>
-                    <a:blip r:embed="rId28">
+                    <a:blip r:embed="rId24">
                       <a:extLst>
                         <a:ext uri="{28A0092B-C50C-407E-A947-70E740481C1C}">
                           <a14:useLocalDpi xmlns:a14="http://schemas.microsoft.com/office/drawing/2010/main" val="0"/>
@@ -4128,9 +3602,842 @@
           </wp:anchor>
         </w:drawing>
       </w:r>
+      <w:r>
+        <w:rPr>
+          <w:lang w:val="es-ES"/>
+        </w:rPr>
+        <w:t>Aquí el usuario se podrá registrar por primera vez.</w:t>
+      </w:r>
+    </w:p>
+    <w:p>
+      <w:pPr>
+        <w:rPr>
+          <w:lang w:val="es-ES"/>
+        </w:rPr>
+      </w:pPr>
+      <w:r>
+        <w:rPr>
+          <w:lang w:val="es-ES"/>
+        </w:rPr>
+        <w:drawing>
+          <wp:anchor distT="0" distB="0" distL="114300" distR="114300" simplePos="0" relativeHeight="251671552" behindDoc="0" locked="0" layoutInCell="1" allowOverlap="1" wp14:anchorId="773055FB" wp14:editId="5032FDE1">
+            <wp:simplePos x="0" y="0"/>
+            <wp:positionH relativeFrom="margin">
+              <wp:align>left</wp:align>
+            </wp:positionH>
+            <wp:positionV relativeFrom="page">
+              <wp:posOffset>5458460</wp:posOffset>
+            </wp:positionV>
+            <wp:extent cx="5113020" cy="4861560"/>
+            <wp:effectExtent l="0" t="0" r="0" b="0"/>
+            <wp:wrapTopAndBottom/>
+            <wp:docPr id="538324341" name="Imagen 1" descr="Interfaz de usuario gráfica, Aplicación, Sitio web&#10;&#10;El contenido generado por IA puede ser incorrecto."/>
+            <wp:cNvGraphicFramePr>
+              <a:graphicFrameLocks xmlns:a="http://schemas.openxmlformats.org/drawingml/2006/main" noChangeAspect="1"/>
+            </wp:cNvGraphicFramePr>
+            <a:graphic xmlns:a="http://schemas.openxmlformats.org/drawingml/2006/main">
+              <a:graphicData uri="http://schemas.openxmlformats.org/drawingml/2006/picture">
+                <pic:pic xmlns:pic="http://schemas.openxmlformats.org/drawingml/2006/picture">
+                  <pic:nvPicPr>
+                    <pic:cNvPr id="538324341" name="Imagen 1" descr="Interfaz de usuario gráfica, Aplicación, Sitio web&#10;&#10;El contenido generado por IA puede ser incorrecto."/>
+                    <pic:cNvPicPr/>
+                  </pic:nvPicPr>
+                  <pic:blipFill>
+                    <a:blip r:embed="rId25" cstate="print">
+                      <a:extLst>
+                        <a:ext uri="{28A0092B-C50C-407E-A947-70E740481C1C}">
+                          <a14:useLocalDpi xmlns:a14="http://schemas.microsoft.com/office/drawing/2010/main" val="0"/>
+                        </a:ext>
+                      </a:extLst>
+                    </a:blip>
+                    <a:stretch>
+                      <a:fillRect/>
+                    </a:stretch>
+                  </pic:blipFill>
+                  <pic:spPr>
+                    <a:xfrm>
+                      <a:off x="0" y="0"/>
+                      <a:ext cx="5113020" cy="4861560"/>
+                    </a:xfrm>
+                    <a:prstGeom prst="rect">
+                      <a:avLst/>
+                    </a:prstGeom>
+                  </pic:spPr>
+                </pic:pic>
+              </a:graphicData>
+            </a:graphic>
+            <wp14:sizeRelH relativeFrom="margin">
+              <wp14:pctWidth>0</wp14:pctWidth>
+            </wp14:sizeRelH>
+            <wp14:sizeRelV relativeFrom="margin">
+              <wp14:pctHeight>0</wp14:pctHeight>
+            </wp14:sizeRelV>
+          </wp:anchor>
+        </w:drawing>
+      </w:r>
+    </w:p>
+    <w:p>
+      <w:pPr>
+        <w:pStyle w:val="Ttulo2"/>
+        <w:rPr>
+          <w:lang w:val="es-ES"/>
+        </w:rPr>
+      </w:pPr>
+      <w:r>
+        <w:rPr>
+          <w:lang w:val="es-ES"/>
+        </w:rPr>
+        <w:t>Home de Usuario</w:t>
+      </w:r>
+    </w:p>
+    <w:p>
+      <w:pPr>
+        <w:rPr>
+          <w:lang w:val="es-ES"/>
+        </w:rPr>
+      </w:pPr>
+    </w:p>
+    <w:p>
+      <w:pPr>
+        <w:rPr>
+          <w:lang w:val="es-ES"/>
+        </w:rPr>
+      </w:pPr>
+      <w:r>
+        <w:rPr>
+          <w:lang w:val="es-ES"/>
+        </w:rPr>
+        <w:lastRenderedPageBreak/>
+        <w:t>Así vera el usuario la pagina a la hora de ingresar a la vista principal mostrando como destacados los productos en descuento teniendo el precio anterior tachado con una x para que el usuario pueda realizar una comparación de precios.</w:t>
+      </w:r>
+    </w:p>
+    <w:p>
+      <w:pPr>
+        <w:pStyle w:val="Ttulo2"/>
+        <w:rPr>
+          <w:lang w:val="es-ES"/>
+        </w:rPr>
+      </w:pPr>
+      <w:r>
+        <w:rPr>
+          <w:lang w:val="es-ES"/>
+        </w:rPr>
+        <w:drawing>
+          <wp:anchor distT="0" distB="0" distL="114300" distR="114300" simplePos="0" relativeHeight="251672576" behindDoc="0" locked="0" layoutInCell="1" allowOverlap="1" wp14:anchorId="13053E4A" wp14:editId="0A0478CE">
+            <wp:simplePos x="0" y="0"/>
+            <wp:positionH relativeFrom="margin">
+              <wp:align>left</wp:align>
+            </wp:positionH>
+            <wp:positionV relativeFrom="page">
+              <wp:posOffset>1965960</wp:posOffset>
+            </wp:positionV>
+            <wp:extent cx="5400040" cy="1722755"/>
+            <wp:effectExtent l="0" t="0" r="0" b="0"/>
+            <wp:wrapTopAndBottom/>
+            <wp:docPr id="2122529115" name="Imagen 1" descr="Interfaz de usuario gráfica, Aplicación&#10;&#10;El contenido generado por IA puede ser incorrecto."/>
+            <wp:cNvGraphicFramePr>
+              <a:graphicFrameLocks xmlns:a="http://schemas.openxmlformats.org/drawingml/2006/main" noChangeAspect="1"/>
+            </wp:cNvGraphicFramePr>
+            <a:graphic xmlns:a="http://schemas.openxmlformats.org/drawingml/2006/main">
+              <a:graphicData uri="http://schemas.openxmlformats.org/drawingml/2006/picture">
+                <pic:pic xmlns:pic="http://schemas.openxmlformats.org/drawingml/2006/picture">
+                  <pic:nvPicPr>
+                    <pic:cNvPr id="2122529115" name="Imagen 1" descr="Interfaz de usuario gráfica, Aplicación&#10;&#10;El contenido generado por IA puede ser incorrecto."/>
+                    <pic:cNvPicPr/>
+                  </pic:nvPicPr>
+                  <pic:blipFill>
+                    <a:blip r:embed="rId26" cstate="print">
+                      <a:extLst>
+                        <a:ext uri="{28A0092B-C50C-407E-A947-70E740481C1C}">
+                          <a14:useLocalDpi xmlns:a14="http://schemas.microsoft.com/office/drawing/2010/main" val="0"/>
+                        </a:ext>
+                      </a:extLst>
+                    </a:blip>
+                    <a:stretch>
+                      <a:fillRect/>
+                    </a:stretch>
+                  </pic:blipFill>
+                  <pic:spPr>
+                    <a:xfrm>
+                      <a:off x="0" y="0"/>
+                      <a:ext cx="5400040" cy="1722755"/>
+                    </a:xfrm>
+                    <a:prstGeom prst="rect">
+                      <a:avLst/>
+                    </a:prstGeom>
+                  </pic:spPr>
+                </pic:pic>
+              </a:graphicData>
+            </a:graphic>
+          </wp:anchor>
+        </w:drawing>
+      </w:r>
+      <w:r>
+        <w:rPr>
+          <w:lang w:val="es-ES"/>
+        </w:rPr>
+        <w:t>Loguin</w:t>
+      </w:r>
+    </w:p>
+    <w:p>
+      <w:pPr>
+        <w:rPr>
+          <w:lang w:val="es-ES"/>
+        </w:rPr>
+      </w:pPr>
+      <w:r>
+        <w:rPr>
+          <w:lang w:val="es-ES"/>
+        </w:rPr>
+        <w:t>Esta es la pantalla de inicio de sesión falta agregarle estilos, pero esta 100% funcional donde el usuario podrá iniciar sesión si es que tiene una cuenta ya registrada.</w:t>
+      </w:r>
+    </w:p>
+    <w:p>
+      <w:pPr>
+        <w:pStyle w:val="Ttulo2"/>
+        <w:rPr>
+          <w:lang w:val="es-ES"/>
+        </w:rPr>
+      </w:pPr>
+      <w:r>
+        <w:rPr>
+          <w:lang w:val="es-ES"/>
+        </w:rPr>
+        <w:t>Registro</w:t>
+      </w:r>
+    </w:p>
+    <w:p>
+      <w:pPr>
+        <w:rPr>
+          <w:lang w:val="es-ES"/>
+        </w:rPr>
+      </w:pPr>
+      <w:r>
+        <w:rPr>
+          <w:lang w:val="es-ES"/>
+        </w:rPr>
+        <w:drawing>
+          <wp:anchor distT="0" distB="0" distL="114300" distR="114300" simplePos="0" relativeHeight="251673600" behindDoc="0" locked="0" layoutInCell="1" allowOverlap="1" wp14:anchorId="68B22EE3" wp14:editId="370305DB">
+            <wp:simplePos x="0" y="0"/>
+            <wp:positionH relativeFrom="column">
+              <wp:posOffset>1905</wp:posOffset>
+            </wp:positionH>
+            <wp:positionV relativeFrom="page">
+              <wp:posOffset>4777740</wp:posOffset>
+            </wp:positionV>
+            <wp:extent cx="5400040" cy="3114040"/>
+            <wp:effectExtent l="0" t="0" r="0" b="0"/>
+            <wp:wrapTopAndBottom/>
+            <wp:docPr id="1014090311" name="Imagen 1" descr="Interfaz de usuario gráfica, Aplicación&#10;&#10;El contenido generado por IA puede ser incorrecto."/>
+            <wp:cNvGraphicFramePr>
+              <a:graphicFrameLocks xmlns:a="http://schemas.openxmlformats.org/drawingml/2006/main" noChangeAspect="1"/>
+            </wp:cNvGraphicFramePr>
+            <a:graphic xmlns:a="http://schemas.openxmlformats.org/drawingml/2006/main">
+              <a:graphicData uri="http://schemas.openxmlformats.org/drawingml/2006/picture">
+                <pic:pic xmlns:pic="http://schemas.openxmlformats.org/drawingml/2006/picture">
+                  <pic:nvPicPr>
+                    <pic:cNvPr id="1014090311" name="Imagen 1" descr="Interfaz de usuario gráfica, Aplicación&#10;&#10;El contenido generado por IA puede ser incorrecto."/>
+                    <pic:cNvPicPr/>
+                  </pic:nvPicPr>
+                  <pic:blipFill>
+                    <a:blip r:embed="rId27" cstate="print">
+                      <a:extLst>
+                        <a:ext uri="{28A0092B-C50C-407E-A947-70E740481C1C}">
+                          <a14:useLocalDpi xmlns:a14="http://schemas.microsoft.com/office/drawing/2010/main" val="0"/>
+                        </a:ext>
+                      </a:extLst>
+                    </a:blip>
+                    <a:stretch>
+                      <a:fillRect/>
+                    </a:stretch>
+                  </pic:blipFill>
+                  <pic:spPr>
+                    <a:xfrm>
+                      <a:off x="0" y="0"/>
+                      <a:ext cx="5400040" cy="3114040"/>
+                    </a:xfrm>
+                    <a:prstGeom prst="rect">
+                      <a:avLst/>
+                    </a:prstGeom>
+                  </pic:spPr>
+                </pic:pic>
+              </a:graphicData>
+            </a:graphic>
+          </wp:anchor>
+        </w:drawing>
+      </w:r>
+      <w:r>
+        <w:rPr>
+          <w:lang w:val="es-ES"/>
+        </w:rPr>
+        <w:t>aquí el usuario se podrá registrar por primera vez si aun no tiene una cuenta.</w:t>
+      </w:r>
+    </w:p>
+    <w:p>
+      <w:pPr>
+        <w:pStyle w:val="Ttulo2"/>
+        <w:rPr>
+          <w:lang w:val="es-ES"/>
+        </w:rPr>
+      </w:pPr>
+      <w:r>
+        <w:rPr>
+          <w:lang w:val="es-ES"/>
+        </w:rPr>
+        <w:lastRenderedPageBreak/>
+        <w:drawing>
+          <wp:anchor distT="0" distB="0" distL="114300" distR="114300" simplePos="0" relativeHeight="251674624" behindDoc="0" locked="0" layoutInCell="1" allowOverlap="1" wp14:anchorId="6A708A85" wp14:editId="7FF00BD6">
+            <wp:simplePos x="0" y="0"/>
+            <wp:positionH relativeFrom="margin">
+              <wp:align>right</wp:align>
+            </wp:positionH>
+            <wp:positionV relativeFrom="page">
+              <wp:posOffset>1158240</wp:posOffset>
+            </wp:positionV>
+            <wp:extent cx="5400040" cy="2654935"/>
+            <wp:effectExtent l="0" t="0" r="0" b="0"/>
+            <wp:wrapTopAndBottom/>
+            <wp:docPr id="1711553341" name="Imagen 1" descr="Interfaz de usuario gráfica, Aplicación&#10;&#10;El contenido generado por IA puede ser incorrecto."/>
+            <wp:cNvGraphicFramePr>
+              <a:graphicFrameLocks xmlns:a="http://schemas.openxmlformats.org/drawingml/2006/main" noChangeAspect="1"/>
+            </wp:cNvGraphicFramePr>
+            <a:graphic xmlns:a="http://schemas.openxmlformats.org/drawingml/2006/main">
+              <a:graphicData uri="http://schemas.openxmlformats.org/drawingml/2006/picture">
+                <pic:pic xmlns:pic="http://schemas.openxmlformats.org/drawingml/2006/picture">
+                  <pic:nvPicPr>
+                    <pic:cNvPr id="1711553341" name="Imagen 1" descr="Interfaz de usuario gráfica, Aplicación&#10;&#10;El contenido generado por IA puede ser incorrecto."/>
+                    <pic:cNvPicPr/>
+                  </pic:nvPicPr>
+                  <pic:blipFill>
+                    <a:blip r:embed="rId28" cstate="print">
+                      <a:extLst>
+                        <a:ext uri="{28A0092B-C50C-407E-A947-70E740481C1C}">
+                          <a14:useLocalDpi xmlns:a14="http://schemas.microsoft.com/office/drawing/2010/main" val="0"/>
+                        </a:ext>
+                      </a:extLst>
+                    </a:blip>
+                    <a:stretch>
+                      <a:fillRect/>
+                    </a:stretch>
+                  </pic:blipFill>
+                  <pic:spPr>
+                    <a:xfrm>
+                      <a:off x="0" y="0"/>
+                      <a:ext cx="5400040" cy="2654935"/>
+                    </a:xfrm>
+                    <a:prstGeom prst="rect">
+                      <a:avLst/>
+                    </a:prstGeom>
+                  </pic:spPr>
+                </pic:pic>
+              </a:graphicData>
+            </a:graphic>
+          </wp:anchor>
+        </w:drawing>
+      </w:r>
+      <w:r>
+        <w:rPr>
+          <w:lang w:val="es-ES"/>
+        </w:rPr>
+        <w:t>Recuperación de contraseña</w:t>
+      </w:r>
+    </w:p>
+    <w:p>
+      <w:pPr>
+        <w:rPr>
+          <w:lang w:val="es-ES"/>
+        </w:rPr>
+      </w:pPr>
+      <w:r>
+        <w:rPr>
+          <w:lang w:val="es-ES"/>
+        </w:rPr>
+        <w:t>Aquí el usuario podrá ingresar sus datos para recuperar su contraseña si es que se olvidó de esta.</w:t>
+      </w:r>
+    </w:p>
+    <w:p>
+      <w:pPr>
+        <w:pStyle w:val="Ttulo2"/>
+      </w:pPr>
+      <w:r>
+        <w:lastRenderedPageBreak/>
+        <w:drawing>
+          <wp:anchor distT="0" distB="0" distL="114300" distR="114300" simplePos="0" relativeHeight="251675648" behindDoc="0" locked="0" layoutInCell="1" allowOverlap="1" wp14:anchorId="52C2BAB1" wp14:editId="78666DB4">
+            <wp:simplePos x="0" y="0"/>
+            <wp:positionH relativeFrom="margin">
+              <wp:posOffset>-89535</wp:posOffset>
+            </wp:positionH>
+            <wp:positionV relativeFrom="page">
+              <wp:posOffset>1285875</wp:posOffset>
+            </wp:positionV>
+            <wp:extent cx="5400040" cy="5352415"/>
+            <wp:effectExtent l="0" t="0" r="0" b="635"/>
+            <wp:wrapTopAndBottom/>
+            <wp:docPr id="1003353022" name="Imagen 1" descr="Interfaz de usuario gráfica, Sitio web&#10;&#10;El contenido generado por IA puede ser incorrecto."/>
+            <wp:cNvGraphicFramePr>
+              <a:graphicFrameLocks xmlns:a="http://schemas.openxmlformats.org/drawingml/2006/main" noChangeAspect="1"/>
+            </wp:cNvGraphicFramePr>
+            <a:graphic xmlns:a="http://schemas.openxmlformats.org/drawingml/2006/main">
+              <a:graphicData uri="http://schemas.openxmlformats.org/drawingml/2006/picture">
+                <pic:pic xmlns:pic="http://schemas.openxmlformats.org/drawingml/2006/picture">
+                  <pic:nvPicPr>
+                    <pic:cNvPr id="1003353022" name="Imagen 1" descr="Interfaz de usuario gráfica, Sitio web&#10;&#10;El contenido generado por IA puede ser incorrecto."/>
+                    <pic:cNvPicPr/>
+                  </pic:nvPicPr>
+                  <pic:blipFill>
+                    <a:blip r:embed="rId29" cstate="print">
+                      <a:extLst>
+                        <a:ext uri="{28A0092B-C50C-407E-A947-70E740481C1C}">
+                          <a14:useLocalDpi xmlns:a14="http://schemas.microsoft.com/office/drawing/2010/main" val="0"/>
+                        </a:ext>
+                      </a:extLst>
+                    </a:blip>
+                    <a:stretch>
+                      <a:fillRect/>
+                    </a:stretch>
+                  </pic:blipFill>
+                  <pic:spPr>
+                    <a:xfrm>
+                      <a:off x="0" y="0"/>
+                      <a:ext cx="5400040" cy="5352415"/>
+                    </a:xfrm>
+                    <a:prstGeom prst="rect">
+                      <a:avLst/>
+                    </a:prstGeom>
+                  </pic:spPr>
+                </pic:pic>
+              </a:graphicData>
+            </a:graphic>
+            <wp14:sizeRelV relativeFrom="margin">
+              <wp14:pctHeight>0</wp14:pctHeight>
+            </wp14:sizeRelV>
+          </wp:anchor>
+        </w:drawing>
+      </w:r>
+      <w:r>
+        <w:t>Panel de administrador</w:t>
+      </w:r>
+    </w:p>
+    <w:tbl>
+      <w:tblPr>
+        <w:tblStyle w:val="Tablaconcuadrcula"/>
+        <w:tblpPr w:leftFromText="141" w:rightFromText="141" w:vertAnchor="text" w:horzAnchor="margin" w:tblpXSpec="right" w:tblpY="10524"/>
+        <w:tblW w:w="8636" w:type="dxa"/>
+        <w:tblLayout w:type="fixed"/>
+        <w:tblLook w:val="04A0" w:firstRow="1" w:lastRow="0" w:firstColumn="1" w:lastColumn="0" w:noHBand="0" w:noVBand="1"/>
+      </w:tblPr>
+      <w:tblGrid>
+        <w:gridCol w:w="969"/>
+        <w:gridCol w:w="869"/>
+        <w:gridCol w:w="6798"/>
+      </w:tblGrid>
+      <w:tr>
+        <w:tc>
+          <w:tcPr>
+            <w:tcW w:w="969" w:type="dxa"/>
+            <w:shd w:val="clear" w:color="auto" w:fill="45B0E1" w:themeFill="accent1" w:themeFillTint="99"/>
+          </w:tcPr>
+          <w:p>
+            <w:pPr>
+              <w:jc w:val="center"/>
+              <w:rPr>
+                <w:lang w:val="es-ES"/>
+              </w:rPr>
+            </w:pPr>
+            <w:r>
+              <w:rPr>
+                <w:lang w:val="es-ES"/>
+              </w:rPr>
+              <w:t>Herramienta</w:t>
+            </w:r>
+          </w:p>
+        </w:tc>
+        <w:tc>
+          <w:tcPr>
+            <w:tcW w:w="869" w:type="dxa"/>
+            <w:shd w:val="clear" w:color="auto" w:fill="45B0E1" w:themeFill="accent1" w:themeFillTint="99"/>
+          </w:tcPr>
+          <w:p>
+            <w:pPr>
+              <w:jc w:val="center"/>
+              <w:rPr>
+                <w:lang w:val="es-ES"/>
+              </w:rPr>
+            </w:pPr>
+            <w:r>
+              <w:rPr>
+                <w:lang w:val="es-ES"/>
+              </w:rPr>
+              <w:t>Versión</w:t>
+            </w:r>
+          </w:p>
+        </w:tc>
+        <w:tc>
+          <w:tcPr>
+            <w:tcW w:w="6798" w:type="dxa"/>
+            <w:shd w:val="clear" w:color="auto" w:fill="45B0E1" w:themeFill="accent1" w:themeFillTint="99"/>
+          </w:tcPr>
+          <w:p>
+            <w:pPr>
+              <w:jc w:val="center"/>
+              <w:rPr>
+                <w:lang w:val="es-ES"/>
+              </w:rPr>
+            </w:pPr>
+            <w:r>
+              <w:rPr>
+                <w:lang w:val="es-ES"/>
+              </w:rPr>
+              <w:t>Enlace</w:t>
+            </w:r>
+          </w:p>
+        </w:tc>
+      </w:tr>
+      <w:tr>
+        <w:trPr>
+          <w:trHeight w:val="673"/>
+        </w:trPr>
+        <w:tc>
+          <w:tcPr>
+            <w:tcW w:w="969" w:type="dxa"/>
+            <w:shd w:val="clear" w:color="auto" w:fill="FFFFFF" w:themeFill="background1"/>
+          </w:tcPr>
+          <w:p>
+            <w:pPr>
+              <w:jc w:val="center"/>
+              <w:rPr>
+                <w:lang w:val="es-ES"/>
+              </w:rPr>
+            </w:pPr>
+            <w:r>
+              <w:rPr>
+                <w:lang w:val="es-ES"/>
+              </w:rPr>
+              <w:t>Trello</w:t>
+            </w:r>
+          </w:p>
+        </w:tc>
+        <w:tc>
+          <w:tcPr>
+            <w:tcW w:w="869" w:type="dxa"/>
+            <w:shd w:val="clear" w:color="auto" w:fill="FFFFFF" w:themeFill="background1"/>
+          </w:tcPr>
+          <w:p>
+            <w:pPr>
+              <w:jc w:val="center"/>
+              <w:rPr>
+                <w:lang w:val="es-ES"/>
+              </w:rPr>
+            </w:pPr>
+            <w:r>
+              <w:rPr>
+                <w:lang w:val="es-ES"/>
+              </w:rPr>
+              <w:t>Web</w:t>
+            </w:r>
+          </w:p>
+        </w:tc>
+        <w:tc>
+          <w:tcPr>
+            <w:tcW w:w="6798" w:type="dxa"/>
+            <w:shd w:val="clear" w:color="auto" w:fill="FFFFFF" w:themeFill="background1"/>
+          </w:tcPr>
+          <w:p>
+            <w:pPr>
+              <w:jc w:val="center"/>
+              <w:rPr>
+                <w:lang w:val="es-ES"/>
+              </w:rPr>
+            </w:pPr>
+            <w:hyperlink r:id="rId30" w:history="1">
+              <w:r>
+                <w:rPr>
+                  <w:rStyle w:val="Hipervnculo"/>
+                  <w:lang w:val="es-ES"/>
+                </w:rPr>
+                <w:t>https://trello.com/invite/b/6824f1244c774299daa63e05/ATTI4f4ba18515ee1e78a96ca10fd415c25027583D96/tpi-datamids</w:t>
+              </w:r>
+            </w:hyperlink>
+          </w:p>
+        </w:tc>
+      </w:tr>
+      <w:tr>
+        <w:trPr>
+          <w:trHeight w:val="203"/>
+        </w:trPr>
+        <w:tc>
+          <w:tcPr>
+            <w:tcW w:w="969" w:type="dxa"/>
+            <w:shd w:val="clear" w:color="auto" w:fill="C1E4F5" w:themeFill="accent1" w:themeFillTint="33"/>
+          </w:tcPr>
+          <w:p>
+            <w:pPr>
+              <w:jc w:val="center"/>
+              <w:rPr>
+                <w:lang w:val="es-ES"/>
+              </w:rPr>
+            </w:pPr>
+            <w:r>
+              <w:rPr>
+                <w:lang w:val="es-ES"/>
+              </w:rPr>
+              <w:t>GitHub</w:t>
+            </w:r>
+          </w:p>
+        </w:tc>
+        <w:tc>
+          <w:tcPr>
+            <w:tcW w:w="869" w:type="dxa"/>
+            <w:shd w:val="clear" w:color="auto" w:fill="C1E4F5" w:themeFill="accent1" w:themeFillTint="33"/>
+          </w:tcPr>
+          <w:p>
+            <w:pPr>
+              <w:jc w:val="center"/>
+              <w:rPr>
+                <w:lang w:val="es-ES"/>
+              </w:rPr>
+            </w:pPr>
+            <w:r>
+              <w:rPr>
+                <w:lang w:val="es-ES"/>
+              </w:rPr>
+              <w:t>Web</w:t>
+            </w:r>
+          </w:p>
+        </w:tc>
+        <w:tc>
+          <w:tcPr>
+            <w:tcW w:w="6798" w:type="dxa"/>
+            <w:shd w:val="clear" w:color="auto" w:fill="C1E4F5" w:themeFill="accent1" w:themeFillTint="33"/>
+          </w:tcPr>
+          <w:p>
+            <w:pPr>
+              <w:jc w:val="center"/>
+              <w:rPr>
+                <w:lang w:val="es-ES"/>
+              </w:rPr>
+            </w:pPr>
+            <w:hyperlink r:id="rId31" w:history="1">
+              <w:r>
+                <w:rPr>
+                  <w:rStyle w:val="Hipervnculo"/>
+                  <w:lang w:val="es-ES"/>
+                </w:rPr>
+                <w:t>https://github.com/LucaseDallAgnese/Proyecto_Integrador.git</w:t>
+              </w:r>
+            </w:hyperlink>
+          </w:p>
+        </w:tc>
+      </w:tr>
+      <w:tr>
+        <w:trPr>
+          <w:trHeight w:val="203"/>
+        </w:trPr>
+        <w:tc>
+          <w:tcPr>
+            <w:tcW w:w="969" w:type="dxa"/>
+            <w:shd w:val="clear" w:color="auto" w:fill="FFFFFF" w:themeFill="background1"/>
+          </w:tcPr>
+          <w:p>
+            <w:pPr>
+              <w:jc w:val="center"/>
+              <w:rPr>
+                <w:lang w:val="es-ES"/>
+              </w:rPr>
+            </w:pPr>
+            <w:r>
+              <w:rPr>
+                <w:lang w:val="es-ES"/>
+              </w:rPr>
+              <w:t>Git</w:t>
+            </w:r>
+          </w:p>
+        </w:tc>
+        <w:tc>
+          <w:tcPr>
+            <w:tcW w:w="869" w:type="dxa"/>
+            <w:shd w:val="clear" w:color="auto" w:fill="FFFFFF" w:themeFill="background1"/>
+          </w:tcPr>
+          <w:p>
+            <w:pPr>
+              <w:jc w:val="center"/>
+              <w:rPr>
+                <w:b/>
+                <w:bCs/>
+                <w:lang w:val="es-ES"/>
+              </w:rPr>
+            </w:pPr>
+            <w:r>
+              <w:rPr>
+                <w:b/>
+                <w:bCs/>
+                <w:lang w:val="es-ES"/>
+              </w:rPr>
+              <w:t>5.6.2</w:t>
+            </w:r>
+          </w:p>
+        </w:tc>
+        <w:tc>
+          <w:tcPr>
+            <w:tcW w:w="6798" w:type="dxa"/>
+            <w:shd w:val="clear" w:color="auto" w:fill="FFFFFF" w:themeFill="background1"/>
+          </w:tcPr>
+          <w:p>
+            <w:pPr>
+              <w:jc w:val="center"/>
+              <w:rPr>
+                <w:lang w:val="es-ES"/>
+              </w:rPr>
+            </w:pPr>
+            <w:hyperlink r:id="rId32" w:history="1">
+              <w:r>
+                <w:rPr>
+                  <w:rStyle w:val="Hipervnculo"/>
+                  <w:lang w:val="es-ES"/>
+                </w:rPr>
+                <w:t>https://git-scm.com/</w:t>
+              </w:r>
+            </w:hyperlink>
+          </w:p>
+        </w:tc>
+      </w:tr>
+      <w:tr>
+        <w:trPr>
+          <w:trHeight w:val="203"/>
+        </w:trPr>
+        <w:tc>
+          <w:tcPr>
+            <w:tcW w:w="969" w:type="dxa"/>
+            <w:shd w:val="clear" w:color="auto" w:fill="C1E4F5" w:themeFill="accent1" w:themeFillTint="33"/>
+          </w:tcPr>
+          <w:p>
+            <w:pPr>
+              <w:jc w:val="center"/>
+              <w:rPr>
+                <w:lang w:val="es-ES"/>
+              </w:rPr>
+            </w:pPr>
+            <w:r>
+              <w:rPr>
+                <w:lang w:val="es-ES"/>
+              </w:rPr>
+              <w:t>Visual</w:t>
+            </w:r>
+          </w:p>
+          <w:p>
+            <w:pPr>
+              <w:jc w:val="center"/>
+              <w:rPr>
+                <w:lang w:val="es-ES"/>
+              </w:rPr>
+            </w:pPr>
+            <w:r>
+              <w:rPr>
+                <w:lang w:val="es-ES"/>
+              </w:rPr>
+              <w:t>Studio</w:t>
+            </w:r>
+          </w:p>
+          <w:p>
+            <w:pPr>
+              <w:jc w:val="center"/>
+              <w:rPr>
+                <w:lang w:val="es-ES"/>
+              </w:rPr>
+            </w:pPr>
+            <w:r>
+              <w:rPr>
+                <w:lang w:val="es-ES"/>
+              </w:rPr>
+              <w:t>Code</w:t>
+            </w:r>
+          </w:p>
+        </w:tc>
+        <w:tc>
+          <w:tcPr>
+            <w:tcW w:w="869" w:type="dxa"/>
+            <w:shd w:val="clear" w:color="auto" w:fill="C1E4F5" w:themeFill="accent1" w:themeFillTint="33"/>
+          </w:tcPr>
+          <w:p>
+            <w:pPr>
+              <w:jc w:val="center"/>
+              <w:rPr>
+                <w:b/>
+                <w:bCs/>
+              </w:rPr>
+            </w:pPr>
+          </w:p>
+          <w:p>
+            <w:pPr>
+              <w:jc w:val="center"/>
+              <w:rPr>
+                <w:lang w:val="es-ES"/>
+              </w:rPr>
+            </w:pPr>
+            <w:r>
+              <w:rPr>
+                <w:b/>
+                <w:bCs/>
+              </w:rPr>
+              <w:t xml:space="preserve"> 1</w:t>
+            </w:r>
+            <w:r>
+              <w:rPr>
+                <w:b/>
+                <w:bCs/>
+                <w:shd w:val="clear" w:color="auto" w:fill="C1E4F5" w:themeFill="accent1" w:themeFillTint="33"/>
+              </w:rPr>
+              <w:t>.</w:t>
+            </w:r>
+            <w:r>
+              <w:rPr>
+                <w:b/>
+                <w:bCs/>
+              </w:rPr>
+              <w:t>103</w:t>
+            </w:r>
+          </w:p>
+        </w:tc>
+        <w:tc>
+          <w:tcPr>
+            <w:tcW w:w="6798" w:type="dxa"/>
+            <w:shd w:val="clear" w:color="auto" w:fill="C1E4F5" w:themeFill="accent1" w:themeFillTint="33"/>
+          </w:tcPr>
+          <w:p>
+            <w:pPr>
+              <w:spacing w:before="240"/>
+              <w:jc w:val="center"/>
+              <w:rPr>
+                <w:lang w:val="es-ES"/>
+              </w:rPr>
+            </w:pPr>
+            <w:hyperlink r:id="rId33" w:history="1">
+              <w:r>
+                <w:rPr>
+                  <w:rStyle w:val="Hipervnculo"/>
+                </w:rPr>
+                <w:t>Visual Studio Code - Code Editing. Redefined</w:t>
+              </w:r>
+            </w:hyperlink>
+          </w:p>
+        </w:tc>
+      </w:tr>
+    </w:tbl>
+    <w:p>
+      <w:pPr>
+        <w:rPr>
+          <w:lang w:val="es-ES"/>
+        </w:rPr>
+      </w:pPr>
+      <w:r>
+        <w:rPr>
+          <w:lang w:val="es-ES"/>
+        </w:rPr>
+        <w:t>Aqui el administrador tiene acceso a todas sus funciones.</w:t>
+      </w:r>
     </w:p>
     <w:sectPr>
-      <w:headerReference w:type="first" r:id="rId29"/>
+      <w:headerReference w:type="first" r:id="rId34"/>
       <w:pgSz w:w="11906" w:h="16838"/>
       <w:pgMar w:top="1418" w:right="1701" w:bottom="1418" w:left="1701" w:header="709" w:footer="709" w:gutter="0"/>
       <w:cols w:space="708"/>
@@ -5805,7 +6112,12 @@
 </file>
 
 <file path=customXml/item2.xml><?xml version="1.0" encoding="utf-8"?>
-<b:Sources xmlns:b="http://schemas.openxmlformats.org/officeDocument/2006/bibliography" xmlns="http://schemas.openxmlformats.org/officeDocument/2006/bibliography" SelectedStyle="\APASixthEditionOfficeOnline.xsl" StyleName="APA" Version="6"/>
+<?mso-contentType ?>
+<FormTemplates xmlns="http://schemas.microsoft.com/sharepoint/v3/contenttype/forms">
+  <Display>DocumentLibraryForm</Display>
+  <Edit>DocumentLibraryForm</Edit>
+  <New>DocumentLibraryForm</New>
+</FormTemplates>
 </file>
 
 <file path=customXml/item3.xml><?xml version="1.0" encoding="utf-8"?>
@@ -5817,12 +6129,7 @@
 </file>
 
 <file path=customXml/item4.xml><?xml version="1.0" encoding="utf-8"?>
-<?mso-contentType ?>
-<FormTemplates xmlns="http://schemas.microsoft.com/sharepoint/v3/contenttype/forms">
-  <Display>DocumentLibraryForm</Display>
-  <Edit>DocumentLibraryForm</Edit>
-  <New>DocumentLibraryForm</New>
-</FormTemplates>
+<b:Sources xmlns:b="http://schemas.openxmlformats.org/officeDocument/2006/bibliography" xmlns="http://schemas.openxmlformats.org/officeDocument/2006/bibliography" SelectedStyle="\APASixthEditionOfficeOnline.xsl" StyleName="APA" Version="6"/>
 </file>
 
 <file path=customXml/itemProps1.xml><?xml version="1.0" encoding="utf-8"?>
@@ -5844,9 +6151,9 @@
 </file>
 
 <file path=customXml/itemProps2.xml><?xml version="1.0" encoding="utf-8"?>
-<ds:datastoreItem xmlns:ds="http://schemas.openxmlformats.org/officeDocument/2006/customXml" ds:itemID="{6DF2A511-C269-4938-91CD-02605702EF18}">
+<ds:datastoreItem xmlns:ds="http://schemas.openxmlformats.org/officeDocument/2006/customXml" ds:itemID="{27769880-C212-4CD5-B430-6518213221F6}">
   <ds:schemaRefs>
-    <ds:schemaRef ds:uri="http://schemas.openxmlformats.org/officeDocument/2006/bibliography"/>
+    <ds:schemaRef ds:uri="http://schemas.microsoft.com/sharepoint/v3/contenttype/forms"/>
   </ds:schemaRefs>
 </ds:datastoreItem>
 </file>
@@ -5862,9 +6169,9 @@
 </file>
 
 <file path=customXml/itemProps4.xml><?xml version="1.0" encoding="utf-8"?>
-<ds:datastoreItem xmlns:ds="http://schemas.openxmlformats.org/officeDocument/2006/customXml" ds:itemID="{27769880-C212-4CD5-B430-6518213221F6}">
+<ds:datastoreItem xmlns:ds="http://schemas.openxmlformats.org/officeDocument/2006/customXml" ds:itemID="{6DF2A511-C269-4938-91CD-02605702EF18}">
   <ds:schemaRefs>
-    <ds:schemaRef ds:uri="http://schemas.microsoft.com/sharepoint/v3/contenttype/forms"/>
+    <ds:schemaRef ds:uri="http://schemas.openxmlformats.org/officeDocument/2006/bibliography"/>
   </ds:schemaRefs>
 </ds:datastoreItem>
 </file>
</xml_diff>